<commit_message>
fix(docs): perbarui file Word dan PDF essay i² = -1 dengan stretchy brackets dan vertical fractions
</commit_message>
<xml_diff>
--- a/public/tugas/KP21517003/Essay_i_Kuadrat_Sama_Dengan_Negatif_Satu_Ryan_Wardiana.docx
+++ b/public/tugas/KP21517003/Essay_i_Kuadrat_Sama_Dengan_Negatif_Satu_Ryan_Wardiana.docx
@@ -582,8 +582,24 @@
           <w:color w:val="B91C1C"/>
           <w:sz w:val="23"/>
         </w:rPr>
-        <w:t>Peringatan Kritis: Bahaya Mendefinisikan i = √(-1)</w:t>
+        <w:t xml:space="preserve">Peringatan Kritis: Bahaya Mendefinisikan </w:t>
       </w:r>
+      <m:oMath xmlns:mml="http://www.w3.org/1998/Math/MathML">
+        <m:r>
+          <m:t>i=</m:t>
+        </m:r>
+        <m:rad>
+          <m:radPr>
+            <m:degHide m:val="on"/>
+          </m:radPr>
+          <m:deg/>
+          <m:e>
+            <m:r>
+              <m:t>−1</m:t>
+            </m:r>
+          </m:e>
+        </m:rad>
+      </m:oMath>
     </w:p>
     <w:p>
       <w:pPr>
@@ -1055,23 +1071,38 @@
       <m:oMathPara>
         <m:oMath xmlns:mml="http://www.w3.org/1998/Math/MathML">
           <m:r>
-            <m:t>ℂ≅ℝ[x]/⟨</m:t>
+            <m:t>ℂ≅</m:t>
           </m:r>
-          <m:sSup>
-            <m:e>
+          <m:f>
+            <m:fPr>
+              <m:type m:val="bar"/>
+            </m:fPr>
+            <m:num>
               <m:r>
-                <m:t>x</m:t>
+                <m:t>ℝ[x]</m:t>
               </m:r>
-            </m:e>
-            <m:sup>
+            </m:num>
+            <m:den>
               <m:r>
-                <m:t>2</m:t>
+                <m:t>⟨</m:t>
               </m:r>
-            </m:sup>
-          </m:sSup>
-          <m:r>
-            <m:t>+1⟩</m:t>
-          </m:r>
+              <m:sSup>
+                <m:e>
+                  <m:r>
+                    <m:t>x</m:t>
+                  </m:r>
+                </m:e>
+                <m:sup>
+                  <m:r>
+                    <m:t>2</m:t>
+                  </m:r>
+                </m:sup>
+              </m:sSup>
+              <m:r>
+                <m:t>+1⟩</m:t>
+              </m:r>
+            </m:den>
+          </m:f>
         </m:oMath>
       </m:oMathPara>
     </w:p>
@@ -1147,6 +1178,7 @@
     </w:p>
     <w:p>
       <w:pPr>
+        <w:keepNext/>
         <w:spacing w:before="240" w:after="80"/>
       </w:pPr>
       <w:r>
@@ -1277,31 +1309,37 @@
             </m:sup>
           </m:sSup>
           <m:r>
-            <m:t>(</m:t>
+            <m:t>=</m:t>
           </m:r>
-          <m:f>
-            <m:fPr>
-              <m:type m:val="bar"/>
-            </m:fPr>
-            <m:num>
-              <m:r>
-                <m:t>π</m:t>
-              </m:r>
-            </m:num>
-            <m:den>
-              <m:r>
-                <m:t>2</m:t>
-              </m:r>
-            </m:den>
-          </m:f>
+          <m:d>
+            <m:dPr>
+              <m:begChr m:val="("/>
+              <m:endChr m:val=")"/>
+              <m:grow m:val="on"/>
+            </m:dPr>
+            <m:e>
+              <m:f>
+                <m:fPr>
+                  <m:type m:val="bar"/>
+                </m:fPr>
+                <m:num>
+                  <m:r>
+                    <m:t>π</m:t>
+                  </m:r>
+                </m:num>
+                <m:den>
+                  <m:r>
+                    <m:t>2</m:t>
+                  </m:r>
+                </m:den>
+              </m:f>
+            </m:e>
+          </m:d>
           <m:r>
             <m:rPr>
               <m:nor/>
             </m:rPr>
-            <m:t> radian</m:t>
-          </m:r>
-          <m:r>
-            <m:t>)</m:t>
+            <m:t> rad</m:t>
           </m:r>
         </m:oMath>
       </m:oMathPara>
@@ -1331,57 +1369,60 @@
           <m:r>
             <m:t>i=1·</m:t>
           </m:r>
-          <m:r>
-            <m:t>(</m:t>
-          </m:r>
-          <m:r>
-            <m:rPr>
-              <m:sty m:val="p"/>
-            </m:rPr>
-            <m:t>cos</m:t>
-          </m:r>
-          <m:f>
-            <m:fPr>
-              <m:type m:val="bar"/>
-            </m:fPr>
-            <m:num>
+          <m:d>
+            <m:dPr>
+              <m:begChr m:val="["/>
+              <m:endChr m:val="]"/>
+              <m:grow m:val="on"/>
+            </m:dPr>
+            <m:e>
               <m:r>
-                <m:t>π</m:t>
+                <m:rPr>
+                  <m:sty m:val="p"/>
+                </m:rPr>
+                <m:t>cos</m:t>
               </m:r>
-            </m:num>
-            <m:den>
+              <m:f>
+                <m:fPr>
+                  <m:type m:val="bar"/>
+                </m:fPr>
+                <m:num>
+                  <m:r>
+                    <m:t>π</m:t>
+                  </m:r>
+                </m:num>
+                <m:den>
+                  <m:r>
+                    <m:t>2</m:t>
+                  </m:r>
+                </m:den>
+              </m:f>
               <m:r>
-                <m:t>2</m:t>
+                <m:t>+i</m:t>
               </m:r>
-            </m:den>
-          </m:f>
-          <m:r>
-            <m:t>+i</m:t>
-          </m:r>
-          <m:r>
-            <m:rPr>
-              <m:sty m:val="p"/>
-            </m:rPr>
-            <m:t>sin</m:t>
-          </m:r>
-          <m:f>
-            <m:fPr>
-              <m:type m:val="bar"/>
-            </m:fPr>
-            <m:num>
               <m:r>
-                <m:t>π</m:t>
+                <m:rPr>
+                  <m:sty m:val="p"/>
+                </m:rPr>
+                <m:t>sin</m:t>
               </m:r>
-            </m:num>
-            <m:den>
-              <m:r>
-                <m:t>2</m:t>
-              </m:r>
-            </m:den>
-          </m:f>
-          <m:r>
-            <m:t>)</m:t>
-          </m:r>
+              <m:f>
+                <m:fPr>
+                  <m:type m:val="bar"/>
+                </m:fPr>
+                <m:num>
+                  <m:r>
+                    <m:t>π</m:t>
+                  </m:r>
+                </m:num>
+                <m:den>
+                  <m:r>
+                    <m:t>2</m:t>
+                  </m:r>
+                </m:den>
+              </m:f>
+            </m:e>
+          </m:d>
           <m:r>
             <m:t>=</m:t>
           </m:r>
@@ -1393,12 +1434,32 @@
             </m:e>
             <m:sup>
               <m:r>
-                <m:t>iπ/2</m:t>
+                <m:t>i</m:t>
               </m:r>
+              <m:f>
+                <m:fPr>
+                  <m:type m:val="bar"/>
+                </m:fPr>
+                <m:num>
+                  <m:r>
+                    <m:t>π</m:t>
+                  </m:r>
+                </m:num>
+                <m:den>
+                  <m:r>
+                    <m:t>2</m:t>
+                  </m:r>
+                </m:den>
+              </m:f>
             </m:sup>
           </m:sSup>
         </m:oMath>
       </m:oMathPara>
+    </w:p>
+    <w:p>
+      <w:pPr>
+        <w:jc w:val="center"/>
+      </w:pPr>
       <m:oMathPara>
         <m:oMath xmlns:mml="http://www.w3.org/1998/Math/MathML">
           <m:sSup>
@@ -1429,8 +1490,23 @@
                 </m:e>
                 <m:sup>
                   <m:r>
-                    <m:t>iπ/2</m:t>
+                    <m:t>i</m:t>
                   </m:r>
+                  <m:f>
+                    <m:fPr>
+                      <m:type m:val="bar"/>
+                    </m:fPr>
+                    <m:num>
+                      <m:r>
+                        <m:t>π</m:t>
+                      </m:r>
+                    </m:num>
+                    <m:den>
+                      <m:r>
+                        <m:t>2</m:t>
+                      </m:r>
+                    </m:den>
+                  </m:f>
                 </m:sup>
               </m:sSup>
               <m:r>
@@ -1468,7 +1544,7 @@
             <m:t>cos</m:t>
           </m:r>
           <m:r>
-            <m:t>(π)+i</m:t>
+            <m:t>π+i</m:t>
           </m:r>
           <m:r>
             <m:rPr>
@@ -1477,13 +1553,14 @@
             <m:t>sin</m:t>
           </m:r>
           <m:r>
-            <m:t>(π)=−1+0=−1</m:t>
+            <m:t>π=−1+0=−1</m:t>
           </m:r>
         </m:oMath>
       </m:oMathPara>
     </w:p>
     <w:p>
       <w:pPr>
+        <w:keepNext/>
         <w:spacing w:before="240" w:after="80"/>
       </w:pPr>
       <w:r>
@@ -1837,6 +1914,11 @@
           </m:r>
         </m:oMath>
       </m:oMathPara>
+    </w:p>
+    <w:p>
+      <w:pPr>
+        <w:jc w:val="center"/>
+      </w:pPr>
       <m:oMathPara>
         <m:oMath xmlns:mml="http://www.w3.org/1998/Math/MathML">
           <m:r>

</xml_diff>

<commit_message>
fix(matrix): kurung siku matriks OMML tinggi utuh vertikal membungkus penuh dua baris
</commit_message>
<xml_diff>
--- a/public/tugas/KP21517003/Essay_i_Kuadrat_Sama_Dengan_Negatif_Satu_Ryan_Wardiana.docx
+++ b/public/tugas/KP21517003/Essay_i_Kuadrat_Sama_Dengan_Negatif_Satu_Ryan_Wardiana.docx
@@ -1592,49 +1592,59 @@
             <m:t>⟷</m:t>
           </m:r>
           <m:r>
-            <m:t>Z=[</m:t>
+            <m:t>Z=</m:t>
           </m:r>
-          <m:m>
-            <m:mPr>
-              <m:baseJc m:val="center"/>
-              <m:plcHide m:val="on"/>
-              <m:mcs>
-                <m:mc>
-                  <m:mcPr>
-                    <m:count m:val="2"/>
-                    <m:mcJc m:val="center"/>
-                  </m:mcPr>
-                </m:mc>
-              </m:mcs>
-            </m:mPr>
-            <m:mr>
-              <m:e>
-                <m:r>
-                  <m:t>a</m:t>
-                </m:r>
-              </m:e>
-              <m:e>
-                <m:r>
-                  <m:t>−b</m:t>
-                </m:r>
-              </m:e>
-            </m:mr>
-            <m:mr>
-              <m:e>
-                <m:r>
-                  <m:t>b</m:t>
-                </m:r>
-              </m:e>
-              <m:e>
-                <m:r>
-                  <m:t>a</m:t>
-                </m:r>
-              </m:e>
-            </m:mr>
-          </m:m>
-          <m:r>
-            <m:t>]</m:t>
-          </m:r>
+          <m:d>
+            <m:dPr>
+              <m:begChr m:val="["/>
+              <m:sepChr m:val=""/>
+              <m:endChr m:val="]"/>
+            </m:dPr>
+            <m:e>
+              <m:m>
+                <m:mPr>
+                  <m:baseJc m:val="center"/>
+                  <m:plcHide m:val="on"/>
+                  <m:mcs>
+                    <m:mc>
+                      <m:mcPr>
+                        <m:count m:val="2"/>
+                        <m:mcJc m:val="center"/>
+                      </m:mcPr>
+                    </m:mc>
+                  </m:mcs>
+                </m:mPr>
+                <m:mr>
+                  <m:e>
+                    <m:r>
+                      <m:t>a</m:t>
+                    </m:r>
+                  </m:e>
+                  <m:e>
+                    <m:r>
+                      <m:t>−b</m:t>
+                    </m:r>
+                  </m:e>
+                </m:mr>
+                <m:mr>
+                  <m:e/>
+                  <m:e/>
+                </m:mr>
+                <m:mr>
+                  <m:e>
+                    <m:r>
+                      <m:t>b</m:t>
+                    </m:r>
+                  </m:e>
+                  <m:e>
+                    <m:r>
+                      <m:t>a</m:t>
+                    </m:r>
+                  </m:e>
+                </m:mr>
+              </m:m>
+            </m:e>
+          </m:d>
         </m:oMath>
       </m:oMathPara>
     </w:p>
@@ -1653,89 +1663,115 @@
       <m:oMathPara>
         <m:oMath xmlns:mml="http://www.w3.org/1998/Math/MathML">
           <m:r>
-            <m:t>Z=a[</m:t>
+            <m:t>Z=a</m:t>
           </m:r>
-          <m:m>
-            <m:mPr>
-              <m:baseJc m:val="center"/>
-              <m:plcHide m:val="on"/>
-              <m:mcs>
-                <m:mc>
-                  <m:mcPr>
-                    <m:count m:val="2"/>
-                    <m:mcJc m:val="center"/>
-                  </m:mcPr>
-                </m:mc>
-              </m:mcs>
-            </m:mPr>
-            <m:mr>
-              <m:e>
-                <m:r>
-                  <m:t>1</m:t>
-                </m:r>
-              </m:e>
-              <m:e>
-                <m:r>
-                  <m:t>0</m:t>
-                </m:r>
-              </m:e>
-            </m:mr>
-            <m:mr>
-              <m:e>
-                <m:r>
-                  <m:t>0</m:t>
-                </m:r>
-              </m:e>
-              <m:e>
-                <m:r>
-                  <m:t>1</m:t>
-                </m:r>
-              </m:e>
-            </m:mr>
-          </m:m>
+          <m:d>
+            <m:dPr>
+              <m:begChr m:val="["/>
+              <m:sepChr m:val=""/>
+              <m:endChr m:val="]"/>
+            </m:dPr>
+            <m:e>
+              <m:m>
+                <m:mPr>
+                  <m:baseJc m:val="center"/>
+                  <m:plcHide m:val="on"/>
+                  <m:mcs>
+                    <m:mc>
+                      <m:mcPr>
+                        <m:count m:val="2"/>
+                        <m:mcJc m:val="center"/>
+                      </m:mcPr>
+                    </m:mc>
+                  </m:mcs>
+                </m:mPr>
+                <m:mr>
+                  <m:e>
+                    <m:r>
+                      <m:t>1</m:t>
+                    </m:r>
+                  </m:e>
+                  <m:e>
+                    <m:r>
+                      <m:t>0</m:t>
+                    </m:r>
+                  </m:e>
+                </m:mr>
+                <m:mr>
+                  <m:e/>
+                  <m:e/>
+                </m:mr>
+                <m:mr>
+                  <m:e>
+                    <m:r>
+                      <m:t>0</m:t>
+                    </m:r>
+                  </m:e>
+                  <m:e>
+                    <m:r>
+                      <m:t>1</m:t>
+                    </m:r>
+                  </m:e>
+                </m:mr>
+              </m:m>
+            </m:e>
+          </m:d>
           <m:r>
-            <m:t>]+b[</m:t>
+            <m:t>+b</m:t>
           </m:r>
-          <m:m>
-            <m:mPr>
-              <m:baseJc m:val="center"/>
-              <m:plcHide m:val="on"/>
-              <m:mcs>
-                <m:mc>
-                  <m:mcPr>
-                    <m:count m:val="2"/>
-                    <m:mcJc m:val="center"/>
-                  </m:mcPr>
-                </m:mc>
-              </m:mcs>
-            </m:mPr>
-            <m:mr>
-              <m:e>
-                <m:r>
-                  <m:t>0</m:t>
-                </m:r>
-              </m:e>
-              <m:e>
-                <m:r>
-                  <m:t>−1</m:t>
-                </m:r>
-              </m:e>
-            </m:mr>
-            <m:mr>
-              <m:e>
-                <m:r>
-                  <m:t>1</m:t>
-                </m:r>
-              </m:e>
-              <m:e>
-                <m:r>
-                  <m:t>0</m:t>
-                </m:r>
-              </m:e>
-            </m:mr>
-          </m:m>
+          <m:d>
+            <m:dPr>
+              <m:begChr m:val="["/>
+              <m:sepChr m:val=""/>
+              <m:endChr m:val="]"/>
+            </m:dPr>
+            <m:e>
+              <m:m>
+                <m:mPr>
+                  <m:baseJc m:val="center"/>
+                  <m:plcHide m:val="on"/>
+                  <m:mcs>
+                    <m:mc>
+                      <m:mcPr>
+                        <m:count m:val="2"/>
+                        <m:mcJc m:val="center"/>
+                      </m:mcPr>
+                    </m:mc>
+                  </m:mcs>
+                </m:mPr>
+                <m:mr>
+                  <m:e>
+                    <m:r>
+                      <m:t>0</m:t>
+                    </m:r>
+                  </m:e>
+                  <m:e>
+                    <m:r>
+                      <m:t>−1</m:t>
+                    </m:r>
+                  </m:e>
+                </m:mr>
+                <m:mr>
+                  <m:e/>
+                  <m:e/>
+                </m:mr>
+                <m:mr>
+                  <m:e>
+                    <m:r>
+                      <m:t>1</m:t>
+                    </m:r>
+                  </m:e>
+                  <m:e>
+                    <m:r>
+                      <m:t>0</m:t>
+                    </m:r>
+                  </m:e>
+                </m:mr>
+              </m:m>
+            </m:e>
+          </m:d>
           <m:r>
-            <m:t>]=aI+bJ</m:t>
+            <m:t>=aI+bJ</m:t>
           </m:r>
         </m:oMath>
       </m:oMathPara>
@@ -1755,49 +1791,59 @@
       <m:oMathPara>
         <m:oMath xmlns:mml="http://www.w3.org/1998/Math/MathML">
           <m:r>
-            <m:t>J=[</m:t>
+            <m:t>J=</m:t>
           </m:r>
-          <m:m>
-            <m:mPr>
-              <m:baseJc m:val="center"/>
-              <m:plcHide m:val="on"/>
-              <m:mcs>
-                <m:mc>
-                  <m:mcPr>
-                    <m:count m:val="2"/>
-                    <m:mcJc m:val="center"/>
-                  </m:mcPr>
-                </m:mc>
-              </m:mcs>
-            </m:mPr>
-            <m:mr>
-              <m:e>
-                <m:r>
-                  <m:t>0</m:t>
-                </m:r>
-              </m:e>
-              <m:e>
-                <m:r>
-                  <m:t>−1</m:t>
-                </m:r>
-              </m:e>
-            </m:mr>
-            <m:mr>
-              <m:e>
-                <m:r>
-                  <m:t>1</m:t>
-                </m:r>
-              </m:e>
-              <m:e>
-                <m:r>
-                  <m:t>0</m:t>
-                </m:r>
-              </m:e>
-            </m:mr>
-          </m:m>
-          <m:r>
-            <m:t>]</m:t>
-          </m:r>
+          <m:d>
+            <m:dPr>
+              <m:begChr m:val="["/>
+              <m:sepChr m:val=""/>
+              <m:endChr m:val="]"/>
+            </m:dPr>
+            <m:e>
+              <m:m>
+                <m:mPr>
+                  <m:baseJc m:val="center"/>
+                  <m:plcHide m:val="on"/>
+                  <m:mcs>
+                    <m:mc>
+                      <m:mcPr>
+                        <m:count m:val="2"/>
+                        <m:mcJc m:val="center"/>
+                      </m:mcPr>
+                    </m:mc>
+                  </m:mcs>
+                </m:mPr>
+                <m:mr>
+                  <m:e>
+                    <m:r>
+                      <m:t>0</m:t>
+                    </m:r>
+                  </m:e>
+                  <m:e>
+                    <m:r>
+                      <m:t>−1</m:t>
+                    </m:r>
+                  </m:e>
+                </m:mr>
+                <m:mr>
+                  <m:e/>
+                  <m:e/>
+                </m:mr>
+                <m:mr>
+                  <m:e>
+                    <m:r>
+                      <m:t>1</m:t>
+                    </m:r>
+                  </m:e>
+                  <m:e>
+                    <m:r>
+                      <m:t>0</m:t>
+                    </m:r>
+                  </m:e>
+                </m:mr>
+              </m:m>
+            </m:e>
+          </m:d>
         </m:oMath>
       </m:oMathPara>
     </w:p>
@@ -1828,90 +1874,110 @@
             </m:sup>
           </m:sSup>
           <m:r>
-            <m:t>=J·J=[</m:t>
+            <m:t>=J·J=</m:t>
           </m:r>
-          <m:m>
-            <m:mPr>
-              <m:baseJc m:val="center"/>
-              <m:plcHide m:val="on"/>
-              <m:mcs>
-                <m:mc>
-                  <m:mcPr>
-                    <m:count m:val="2"/>
-                    <m:mcJc m:val="center"/>
-                  </m:mcPr>
-                </m:mc>
-              </m:mcs>
-            </m:mPr>
-            <m:mr>
-              <m:e>
-                <m:r>
-                  <m:t>0</m:t>
-                </m:r>
-              </m:e>
-              <m:e>
-                <m:r>
-                  <m:t>−1</m:t>
-                </m:r>
-              </m:e>
-            </m:mr>
-            <m:mr>
-              <m:e>
-                <m:r>
-                  <m:t>1</m:t>
-                </m:r>
-              </m:e>
-              <m:e>
-                <m:r>
-                  <m:t>0</m:t>
-                </m:r>
-              </m:e>
-            </m:mr>
-          </m:m>
-          <m:r>
-            <m:t>][</m:t>
-          </m:r>
-          <m:m>
-            <m:mPr>
-              <m:baseJc m:val="center"/>
-              <m:plcHide m:val="on"/>
-              <m:mcs>
-                <m:mc>
-                  <m:mcPr>
-                    <m:count m:val="2"/>
-                    <m:mcJc m:val="center"/>
-                  </m:mcPr>
-                </m:mc>
-              </m:mcs>
-            </m:mPr>
-            <m:mr>
-              <m:e>
-                <m:r>
-                  <m:t>0</m:t>
-                </m:r>
-              </m:e>
-              <m:e>
-                <m:r>
-                  <m:t>−1</m:t>
-                </m:r>
-              </m:e>
-            </m:mr>
-            <m:mr>
-              <m:e>
-                <m:r>
-                  <m:t>1</m:t>
-                </m:r>
-              </m:e>
-              <m:e>
-                <m:r>
-                  <m:t>0</m:t>
-                </m:r>
-              </m:e>
-            </m:mr>
-          </m:m>
-          <m:r>
-            <m:t>]</m:t>
-          </m:r>
+          <m:d>
+            <m:dPr>
+              <m:begChr m:val="["/>
+              <m:sepChr m:val=""/>
+              <m:endChr m:val="]"/>
+            </m:dPr>
+            <m:e>
+              <m:m>
+                <m:mPr>
+                  <m:baseJc m:val="center"/>
+                  <m:plcHide m:val="on"/>
+                  <m:mcs>
+                    <m:mc>
+                      <m:mcPr>
+                        <m:count m:val="2"/>
+                        <m:mcJc m:val="center"/>
+                      </m:mcPr>
+                    </m:mc>
+                  </m:mcs>
+                </m:mPr>
+                <m:mr>
+                  <m:e>
+                    <m:r>
+                      <m:t>0</m:t>
+                    </m:r>
+                  </m:e>
+                  <m:e>
+                    <m:r>
+                      <m:t>−1</m:t>
+                    </m:r>
+                  </m:e>
+                </m:mr>
+                <m:mr>
+                  <m:e/>
+                  <m:e/>
+                </m:mr>
+                <m:mr>
+                  <m:e>
+                    <m:r>
+                      <m:t>1</m:t>
+                    </m:r>
+                  </m:e>
+                  <m:e>
+                    <m:r>
+                      <m:t>0</m:t>
+                    </m:r>
+                  </m:e>
+                </m:mr>
+              </m:m>
+            </m:e>
+          </m:d>
+          <m:d>
+            <m:dPr>
+              <m:begChr m:val="["/>
+              <m:sepChr m:val=""/>
+              <m:endChr m:val="]"/>
+            </m:dPr>
+            <m:e>
+              <m:m>
+                <m:mPr>
+                  <m:baseJc m:val="center"/>
+                  <m:plcHide m:val="on"/>
+                  <m:mcs>
+                    <m:mc>
+                      <m:mcPr>
+                        <m:count m:val="2"/>
+                        <m:mcJc m:val="center"/>
+                      </m:mcPr>
+                    </m:mc>
+                  </m:mcs>
+                </m:mPr>
+                <m:mr>
+                  <m:e>
+                    <m:r>
+                      <m:t>0</m:t>
+                    </m:r>
+                  </m:e>
+                  <m:e>
+                    <m:r>
+                      <m:t>−1</m:t>
+                    </m:r>
+                  </m:e>
+                </m:mr>
+                <m:mr>
+                  <m:e/>
+                  <m:e/>
+                </m:mr>
+                <m:mr>
+                  <m:e>
+                    <m:r>
+                      <m:t>1</m:t>
+                    </m:r>
+                  </m:e>
+                  <m:e>
+                    <m:r>
+                      <m:t>0</m:t>
+                    </m:r>
+                  </m:e>
+                </m:mr>
+              </m:m>
+            </m:e>
+          </m:d>
         </m:oMath>
       </m:oMathPara>
     </w:p>
@@ -1922,89 +1988,115 @@
       <m:oMathPara>
         <m:oMath xmlns:mml="http://www.w3.org/1998/Math/MathML">
           <m:r>
-            <m:t>=[</m:t>
+            <m:t>=</m:t>
           </m:r>
-          <m:m>
-            <m:mPr>
-              <m:baseJc m:val="center"/>
-              <m:plcHide m:val="on"/>
-              <m:mcs>
-                <m:mc>
-                  <m:mcPr>
-                    <m:count m:val="2"/>
-                    <m:mcJc m:val="center"/>
-                  </m:mcPr>
-                </m:mc>
-              </m:mcs>
-            </m:mPr>
-            <m:mr>
-              <m:e>
-                <m:r>
-                  <m:t>(0)(0)+(−1)(1)</m:t>
-                </m:r>
-              </m:e>
-              <m:e>
-                <m:r>
-                  <m:t>(0)(−1)+(−1)(0)</m:t>
-                </m:r>
-              </m:e>
-            </m:mr>
-            <m:mr>
-              <m:e>
-                <m:r>
-                  <m:t>(1)(0)+(0)(1)</m:t>
-                </m:r>
-              </m:e>
-              <m:e>
-                <m:r>
-                  <m:t>(1)(−1)+(0)(0)</m:t>
-                </m:r>
-              </m:e>
-            </m:mr>
-          </m:m>
+          <m:d>
+            <m:dPr>
+              <m:begChr m:val="["/>
+              <m:sepChr m:val=""/>
+              <m:endChr m:val="]"/>
+            </m:dPr>
+            <m:e>
+              <m:m>
+                <m:mPr>
+                  <m:baseJc m:val="center"/>
+                  <m:plcHide m:val="on"/>
+                  <m:mcs>
+                    <m:mc>
+                      <m:mcPr>
+                        <m:count m:val="2"/>
+                        <m:mcJc m:val="center"/>
+                      </m:mcPr>
+                    </m:mc>
+                  </m:mcs>
+                </m:mPr>
+                <m:mr>
+                  <m:e>
+                    <m:r>
+                      <m:t>(0)(0)+(−1)(1)</m:t>
+                    </m:r>
+                  </m:e>
+                  <m:e>
+                    <m:r>
+                      <m:t>(0)(−1)+(−1)(0)</m:t>
+                    </m:r>
+                  </m:e>
+                </m:mr>
+                <m:mr>
+                  <m:e/>
+                  <m:e/>
+                </m:mr>
+                <m:mr>
+                  <m:e>
+                    <m:r>
+                      <m:t>(1)(0)+(0)(1)</m:t>
+                    </m:r>
+                  </m:e>
+                  <m:e>
+                    <m:r>
+                      <m:t>(1)(−1)+(0)(0)</m:t>
+                    </m:r>
+                  </m:e>
+                </m:mr>
+              </m:m>
+            </m:e>
+          </m:d>
           <m:r>
-            <m:t>]=[</m:t>
+            <m:t>=</m:t>
           </m:r>
-          <m:m>
-            <m:mPr>
-              <m:baseJc m:val="center"/>
-              <m:plcHide m:val="on"/>
-              <m:mcs>
-                <m:mc>
-                  <m:mcPr>
-                    <m:count m:val="2"/>
-                    <m:mcJc m:val="center"/>
-                  </m:mcPr>
-                </m:mc>
-              </m:mcs>
-            </m:mPr>
-            <m:mr>
-              <m:e>
-                <m:r>
-                  <m:t>−1</m:t>
-                </m:r>
-              </m:e>
-              <m:e>
-                <m:r>
-                  <m:t>0</m:t>
-                </m:r>
-              </m:e>
-            </m:mr>
-            <m:mr>
-              <m:e>
-                <m:r>
-                  <m:t>0</m:t>
-                </m:r>
-              </m:e>
-              <m:e>
-                <m:r>
-                  <m:t>−1</m:t>
-                </m:r>
-              </m:e>
-            </m:mr>
-          </m:m>
+          <m:d>
+            <m:dPr>
+              <m:begChr m:val="["/>
+              <m:sepChr m:val=""/>
+              <m:endChr m:val="]"/>
+            </m:dPr>
+            <m:e>
+              <m:m>
+                <m:mPr>
+                  <m:baseJc m:val="center"/>
+                  <m:plcHide m:val="on"/>
+                  <m:mcs>
+                    <m:mc>
+                      <m:mcPr>
+                        <m:count m:val="2"/>
+                        <m:mcJc m:val="center"/>
+                      </m:mcPr>
+                    </m:mc>
+                  </m:mcs>
+                </m:mPr>
+                <m:mr>
+                  <m:e>
+                    <m:r>
+                      <m:t>−1</m:t>
+                    </m:r>
+                  </m:e>
+                  <m:e>
+                    <m:r>
+                      <m:t>0</m:t>
+                    </m:r>
+                  </m:e>
+                </m:mr>
+                <m:mr>
+                  <m:e/>
+                  <m:e/>
+                </m:mr>
+                <m:mr>
+                  <m:e>
+                    <m:r>
+                      <m:t>0</m:t>
+                    </m:r>
+                  </m:e>
+                  <m:e>
+                    <m:r>
+                      <m:t>−1</m:t>
+                    </m:r>
+                  </m:e>
+                </m:mr>
+              </m:m>
+            </m:e>
+          </m:d>
           <m:r>
-            <m:t>]=−I</m:t>
+            <m:t>=−I</m:t>
           </m:r>
         </m:oMath>
       </m:oMathPara>

</xml_diff>

<commit_message>
feat(essay): tambahkan 3 contoh soal penerapan dan pembahasan bertahap ke dalam naskah essay dan web
</commit_message>
<xml_diff>
--- a/public/tugas/KP21517003/Essay_i_Kuadrat_Sama_Dengan_Negatif_Satu_Ryan_Wardiana.docx
+++ b/public/tugas/KP21517003/Essay_i_Kuadrat_Sama_Dengan_Negatif_Satu_Ryan_Wardiana.docx
@@ -2110,15 +2110,479 @@
       </w:r>
     </w:p>
     <w:p>
+      <w:r>
+        <w:br w:type="page"/>
+      </w:r>
+    </w:p>
+    <w:p>
       <w:pPr>
-        <w:spacing w:before="240" w:after="80"/>
+        <w:keepNext/>
+        <w:spacing w:before="160" w:after="80"/>
       </w:pPr>
       <w:r>
         <w:rPr>
           <w:b/>
           <w:sz w:val="26"/>
         </w:rPr>
-        <w:t>6. Refleksi Pedagogis dalam Pendidikan Matematika &amp; Kesimpulan</w:t>
+        <w:t>6. Contoh Soal Penerapan &amp; Pembahasan Bertahap</w:t>
+      </w:r>
+    </w:p>
+    <w:p>
+      <w:pPr>
+        <w:jc w:val="both"/>
+      </w:pPr>
+      <w:r>
+        <w:t>Untuk menguji dan memperdalam pemahaman mengenai keniscayaan relasi i² = -1, berikut disajikan tiga contoh soal fundamental yang mencakup pembuktian aljabar formal Hamilton, aritmetika siklus modulo 4, dan transformasi geometri rotasi bidang Argand. Setiap soal dibahas dengan format runtut: Rumus Variabel → Deklarasi Nilai → Substitusi Bertahap → Kesimpulan Interpretatif.</w:t>
+      </w:r>
+    </w:p>
+    <w:tbl>
+      <w:tblPr>
+        <w:tblW w:type="auto" w:w="0"/>
+        <w:jc w:val="center"/>
+        <w:tblLook w:firstColumn="1" w:firstRow="1" w:lastColumn="0" w:lastRow="0" w:noHBand="0" w:noVBand="1" w:val="04A0"/>
+      </w:tblPr>
+      <w:tblGrid>
+        <w:gridCol w:w="8770"/>
+      </w:tblGrid>
+      <w:tr>
+        <w:tc>
+          <w:tcPr>
+            <w:tcW w:type="dxa" w:w="8770"/>
+            <w:shd w:fill="F8FAFC"/>
+          </w:tcPr>
+          <w:p>
+            <w:pPr>
+              <w:spacing w:after="40" w:line="276" w:lineRule="auto"/>
+            </w:pPr>
+            <w:r>
+              <w:rPr>
+                <w:b/>
+                <w:color w:val="1E3A8A"/>
+              </w:rPr>
+              <w:t>Contoh Soal 1: Pembuktian Aljabar Pasangan Terurut Hamilton</w:t>
+              <w:br/>
+            </w:r>
+            <w:r>
+              <w:t>Soal: Diketahui himpunan bilangan kompleks didefinisikan sebagai pasangan terurut (a, b) ∈ ℝ² dengan i = (0, 1). Hitunglah nilai dari i² dan buktikan secara deduktif bahwa hasilnya setara dengan bilangan real -1.</w:t>
+              <w:br/>
+            </w:r>
+            <w:r>
+              <w:t>1. Rumus Variabel (Definisi Perkalian Hamilton):</w:t>
+            </w:r>
+          </w:p>
+          <w:p>
+            <w:pPr>
+              <w:spacing w:before="40" w:after="40"/>
+              <w:jc w:val="center"/>
+            </w:pPr>
+            <m:oMathPara>
+              <m:oMath xmlns:mml="http://www.w3.org/1998/Math/MathML">
+                <m:r>
+                  <m:t>(a,b)·(c,d)=(ac−bd,</m:t>
+                </m:r>
+                <m:r>
+                  <m:t>ad+bc)</m:t>
+                </m:r>
+              </m:oMath>
+            </m:oMathPara>
+          </w:p>
+          <w:p>
+            <w:pPr>
+              <w:spacing w:before="40" w:after="40" w:line="276" w:lineRule="auto"/>
+            </w:pPr>
+            <w:r>
+              <w:t>2. Deklarasi Nilai: a = 0, b = 1, c = 0, d = 1</w:t>
+              <w:br/>
+            </w:r>
+            <w:r>
+              <w:t>3. Substitusi Bertahap:</w:t>
+            </w:r>
+          </w:p>
+          <w:p>
+            <w:pPr>
+              <w:spacing w:before="40" w:after="40"/>
+              <w:jc w:val="center"/>
+            </w:pPr>
+            <m:oMathPara>
+              <m:oMath xmlns:mml="http://www.w3.org/1998/Math/MathML">
+                <m:sSup>
+                  <m:e>
+                    <m:r>
+                      <m:t>i</m:t>
+                    </m:r>
+                  </m:e>
+                  <m:sup>
+                    <m:r>
+                      <m:t>2</m:t>
+                    </m:r>
+                  </m:sup>
+                </m:sSup>
+                <m:r>
+                  <m:t>=(0,1)·(0,1)=((0)(0)−(1)(1),</m:t>
+                </m:r>
+                <m:r>
+                  <m:t>(0)(1)+(1)(0))=(−1,0)</m:t>
+                </m:r>
+              </m:oMath>
+            </m:oMathPara>
+          </w:p>
+          <w:p>
+            <w:pPr>
+              <w:spacing w:before="40" w:after="40" w:line="276" w:lineRule="auto"/>
+            </w:pPr>
+            <w:r>
+              <w:t>4. Kesimpulan Interpretatif: Karena (x, 0) ≡ x pada sumbu horizontal, maka (-1, 0) ≡ -1. Terbukti murni bahwa i² = -1.</w:t>
+            </w:r>
+          </w:p>
+        </w:tc>
+      </w:tr>
+    </w:tbl>
+    <w:p>
+      <w:pPr>
+        <w:spacing w:after="80"/>
+      </w:pPr>
+    </w:p>
+    <w:tbl>
+      <w:tblPr>
+        <w:tblW w:type="auto" w:w="0"/>
+        <w:jc w:val="center"/>
+        <w:tblLook w:firstColumn="1" w:firstRow="1" w:lastColumn="0" w:lastRow="0" w:noHBand="0" w:noVBand="1" w:val="04A0"/>
+      </w:tblPr>
+      <w:tblGrid>
+        <w:gridCol w:w="8770"/>
+      </w:tblGrid>
+      <w:tr>
+        <w:tc>
+          <w:tcPr>
+            <w:tcW w:type="dxa" w:w="8770"/>
+            <w:shd w:fill="F8FAFC"/>
+          </w:tcPr>
+          <w:p>
+            <w:pPr>
+              <w:spacing w:after="40" w:line="276" w:lineRule="auto"/>
+            </w:pPr>
+            <w:r>
+              <w:rPr>
+                <w:b/>
+                <w:color w:val="1E3A8A"/>
+              </w:rPr>
+              <w:t>Contoh Soal 2: Siklus Pangkat Satuan Imajiner (Aplikasi Aritmetika Modulo 4)</w:t>
+              <w:br/>
+            </w:r>
+            <w:r>
+              <w:t>Soal: Dengan memanfaatkan sifat dasar i² = -1, hitunglah nilai eksak dari i²⁰²⁶ dan invers perkalian i⁻¹.</w:t>
+              <w:br/>
+            </w:r>
+            <w:r>
+              <w:t>Bagian A: 2026 = 4(506) + 2, sehingga:</w:t>
+            </w:r>
+          </w:p>
+          <w:p>
+            <w:pPr>
+              <w:spacing w:before="40" w:after="40"/>
+              <w:jc w:val="center"/>
+            </w:pPr>
+            <m:oMathPara>
+              <m:oMath xmlns:mml="http://www.w3.org/1998/Math/MathML">
+                <m:sSup>
+                  <m:e>
+                    <m:r>
+                      <m:t>i</m:t>
+                    </m:r>
+                  </m:e>
+                  <m:sup>
+                    <m:r>
+                      <m:t>2026</m:t>
+                    </m:r>
+                  </m:sup>
+                </m:sSup>
+                <m:r>
+                  <m:t>=(</m:t>
+                </m:r>
+                <m:sSup>
+                  <m:e>
+                    <m:r>
+                      <m:t>i</m:t>
+                    </m:r>
+                  </m:e>
+                  <m:sup>
+                    <m:r>
+                      <m:t>4</m:t>
+                    </m:r>
+                  </m:sup>
+                </m:sSup>
+                <m:sSup>
+                  <m:e>
+                    <m:r>
+                      <m:t>)</m:t>
+                    </m:r>
+                  </m:e>
+                  <m:sup>
+                    <m:r>
+                      <m:t>506</m:t>
+                    </m:r>
+                  </m:sup>
+                </m:sSup>
+                <m:r>
+                  <m:t>·</m:t>
+                </m:r>
+                <m:sSup>
+                  <m:e>
+                    <m:r>
+                      <m:t>i</m:t>
+                    </m:r>
+                  </m:e>
+                  <m:sup>
+                    <m:r>
+                      <m:t>2</m:t>
+                    </m:r>
+                  </m:sup>
+                </m:sSup>
+                <m:r>
+                  <m:t>=(1</m:t>
+                </m:r>
+                <m:sSup>
+                  <m:e>
+                    <m:r>
+                      <m:t>)</m:t>
+                    </m:r>
+                  </m:e>
+                  <m:sup>
+                    <m:r>
+                      <m:t>506</m:t>
+                    </m:r>
+                  </m:sup>
+                </m:sSup>
+                <m:r>
+                  <m:t>·(−1)=−1</m:t>
+                </m:r>
+              </m:oMath>
+            </m:oMathPara>
+          </w:p>
+          <w:p>
+            <w:pPr>
+              <w:spacing w:before="40" w:after="40" w:line="276" w:lineRule="auto"/>
+            </w:pPr>
+            <w:r>
+              <w:t>Bagian B: Invers perkalian rasionalisasi sekawan:</w:t>
+            </w:r>
+          </w:p>
+          <w:p>
+            <w:pPr>
+              <w:spacing w:before="40" w:after="40"/>
+              <w:jc w:val="center"/>
+            </w:pPr>
+            <m:oMathPara>
+              <m:oMath xmlns:mml="http://www.w3.org/1998/Math/MathML">
+                <m:sSup>
+                  <m:e>
+                    <m:r>
+                      <m:t>i</m:t>
+                    </m:r>
+                  </m:e>
+                  <m:sup>
+                    <m:r>
+                      <m:t>−1</m:t>
+                    </m:r>
+                  </m:sup>
+                </m:sSup>
+                <m:r>
+                  <m:t>=</m:t>
+                </m:r>
+                <m:f>
+                  <m:fPr>
+                    <m:type m:val="bar"/>
+                  </m:fPr>
+                  <m:num>
+                    <m:r>
+                      <m:t>1</m:t>
+                    </m:r>
+                  </m:num>
+                  <m:den>
+                    <m:r>
+                      <m:t>i</m:t>
+                    </m:r>
+                  </m:den>
+                </m:f>
+                <m:r>
+                  <m:t>=</m:t>
+                </m:r>
+                <m:f>
+                  <m:fPr>
+                    <m:type m:val="bar"/>
+                  </m:fPr>
+                  <m:num>
+                    <m:r>
+                      <m:t>1·i</m:t>
+                    </m:r>
+                  </m:num>
+                  <m:den>
+                    <m:r>
+                      <m:t>i·i</m:t>
+                    </m:r>
+                  </m:den>
+                </m:f>
+                <m:r>
+                  <m:t>=</m:t>
+                </m:r>
+                <m:f>
+                  <m:fPr>
+                    <m:type m:val="bar"/>
+                  </m:fPr>
+                  <m:num>
+                    <m:r>
+                      <m:t>i</m:t>
+                    </m:r>
+                  </m:num>
+                  <m:den>
+                    <m:sSup>
+                      <m:e>
+                        <m:r>
+                          <m:t>i</m:t>
+                        </m:r>
+                      </m:e>
+                      <m:sup>
+                        <m:r>
+                          <m:t>2</m:t>
+                        </m:r>
+                      </m:sup>
+                    </m:sSup>
+                  </m:den>
+                </m:f>
+                <m:r>
+                  <m:t>=</m:t>
+                </m:r>
+                <m:f>
+                  <m:fPr>
+                    <m:type m:val="bar"/>
+                  </m:fPr>
+                  <m:num>
+                    <m:r>
+                      <m:t>i</m:t>
+                    </m:r>
+                  </m:num>
+                  <m:den>
+                    <m:r>
+                      <m:t>−1</m:t>
+                    </m:r>
+                  </m:den>
+                </m:f>
+                <m:r>
+                  <m:t>=−i</m:t>
+                </m:r>
+              </m:oMath>
+            </m:oMathPara>
+          </w:p>
+        </w:tc>
+      </w:tr>
+    </w:tbl>
+    <w:p>
+      <w:pPr>
+        <w:spacing w:after="80"/>
+      </w:pPr>
+    </w:p>
+    <w:tbl>
+      <w:tblPr>
+        <w:tblW w:type="auto" w:w="0"/>
+        <w:jc w:val="center"/>
+        <w:tblLook w:firstColumn="1" w:firstRow="1" w:lastColumn="0" w:lastRow="0" w:noHBand="0" w:noVBand="1" w:val="04A0"/>
+      </w:tblPr>
+      <w:tblGrid>
+        <w:gridCol w:w="8770"/>
+      </w:tblGrid>
+      <w:tr>
+        <w:tc>
+          <w:tcPr>
+            <w:tcW w:type="dxa" w:w="8770"/>
+            <w:shd w:fill="F8FAFC"/>
+          </w:tcPr>
+          <w:p>
+            <w:pPr>
+              <w:spacing w:after="40" w:line="276" w:lineRule="auto"/>
+            </w:pPr>
+            <w:r>
+              <w:rPr>
+                <w:b/>
+                <w:color w:val="1E3A8A"/>
+              </w:rPr>
+              <w:t>Contoh Soal 3: Transformasi Geometris Rotasi 90° pada Bidang Argand</w:t>
+              <w:br/>
+            </w:r>
+            <w:r>
+              <w:t>Soal: Titik z₁ = 3 + 2i dirotasikan 90° berlawanan jarum jam terhadap titik pusat origin (0, 0). Tentukan posisi z₂ melalui perkalian satuan i.</w:t>
+              <w:br/>
+            </w:r>
+            <w:r>
+              <w:t>1. Rumus Operator Rotasi: z₂ = z₁ · i = (x + yi) · i = -y + xi</w:t>
+            </w:r>
+          </w:p>
+          <w:p>
+            <w:pPr>
+              <w:spacing w:before="40" w:after="40"/>
+              <w:jc w:val="center"/>
+            </w:pPr>
+            <m:oMathPara>
+              <m:oMath xmlns:mml="http://www.w3.org/1998/Math/MathML">
+                <m:sSub>
+                  <m:e>
+                    <m:r>
+                      <m:t>z</m:t>
+                    </m:r>
+                  </m:e>
+                  <m:sub>
+                    <m:r>
+                      <m:t>2</m:t>
+                    </m:r>
+                  </m:sub>
+                </m:sSub>
+                <m:r>
+                  <m:t>=(3+2i)·i=3i+2(</m:t>
+                </m:r>
+                <m:sSup>
+                  <m:e>
+                    <m:r>
+                      <m:t>i</m:t>
+                    </m:r>
+                  </m:e>
+                  <m:sup>
+                    <m:r>
+                      <m:t>2</m:t>
+                    </m:r>
+                  </m:sup>
+                </m:sSup>
+                <m:r>
+                  <m:t>)=3i+2(−1)=−2+3i</m:t>
+                </m:r>
+              </m:oMath>
+            </m:oMathPara>
+          </w:p>
+          <w:p>
+            <w:pPr>
+              <w:spacing w:before="40" w:after="40" w:line="276" w:lineRule="auto"/>
+            </w:pPr>
+            <w:r>
+              <w:t>2. Kesimpulan: Titik (3, 2) berpindah ke (-2, 3), rotasi tepat 90° dengan modulus konstan: |z₁| = |z₂| = √(3² + 2²) = √13.</w:t>
+            </w:r>
+          </w:p>
+        </w:tc>
+      </w:tr>
+    </w:tbl>
+    <w:p>
+      <w:pPr>
+        <w:spacing w:after="120"/>
+      </w:pPr>
+    </w:p>
+    <w:p>
+      <w:pPr>
+        <w:keepNext/>
+        <w:spacing w:before="280" w:after="80"/>
+      </w:pPr>
+      <w:r>
+        <w:rPr>
+          <w:b/>
+          <w:sz w:val="26"/>
+        </w:rPr>
+        <w:t>7. Refleksi Pedagogis dalam Pendidikan Matematika &amp; Kesimpulan</w:t>
       </w:r>
     </w:p>
     <w:p>
@@ -2184,6 +2648,7 @@
     </w:p>
     <w:p>
       <w:pPr>
+        <w:keepNext/>
         <w:spacing w:before="280" w:after="120"/>
       </w:pPr>
       <w:r>
@@ -2191,7 +2656,7 @@
           <w:b/>
           <w:sz w:val="26"/>
         </w:rPr>
-        <w:t>Daftar Pustaka (Referensi 5 Tahun Terakhir)</w:t>
+        <w:t>8. Daftar Pustaka (Referensi 5 Tahun Terakhir)</w:t>
       </w:r>
     </w:p>
     <w:p>

</xml_diff>